<commit_message>
Bỏ Các file cá nhân
</commit_message>
<xml_diff>
--- a/docs.docx
+++ b/docs.docx
@@ -26,7 +26,8 @@
         <w:rPr>
           <w:b/>
           <w:bCs/>
-          <w:sz w:val="28"/>
+          <w:sz w:val="36"/>
+          <w:szCs w:val="36"/>
           <w:lang w:val="en-US"/>
         </w:rPr>
       </w:pPr>
@@ -34,7 +35,8 @@
         <w:rPr>
           <w:b/>
           <w:bCs/>
-          <w:sz w:val="28"/>
+          <w:sz w:val="36"/>
+          <w:szCs w:val="36"/>
           <w:lang w:val="en-US"/>
         </w:rPr>
         <w:t>Quản Lí Nhân Sự</w:t>
@@ -66,46 +68,50 @@
         <w:tblLook w:val="04A0" w:firstRow="1" w:lastRow="0" w:firstColumn="1" w:lastColumn="0" w:noHBand="0" w:noVBand="1"/>
       </w:tblPr>
       <w:tblGrid>
-        <w:gridCol w:w="1330"/>
-        <w:gridCol w:w="1288"/>
-        <w:gridCol w:w="1275"/>
-        <w:gridCol w:w="1355"/>
-        <w:gridCol w:w="1355"/>
-        <w:gridCol w:w="1492"/>
-        <w:gridCol w:w="1175"/>
-        <w:gridCol w:w="1186"/>
+        <w:gridCol w:w="1307"/>
+        <w:gridCol w:w="1307"/>
+        <w:gridCol w:w="1307"/>
+        <w:gridCol w:w="1307"/>
+        <w:gridCol w:w="977"/>
+        <w:gridCol w:w="1710"/>
+        <w:gridCol w:w="1234"/>
+        <w:gridCol w:w="1307"/>
       </w:tblGrid>
       <w:tr>
         <w:tc>
           <w:tcPr>
-            <w:tcW w:w="1330" w:type="dxa"/>
-          </w:tcPr>
-          <w:p>
-            <w:pPr>
-              <w:rPr>
-                <w:rFonts w:cstheme="minorHAnsi"/>
-                <w:b/>
-                <w:bCs/>
-                <w:lang w:val="en-US"/>
-              </w:rPr>
-            </w:pPr>
-            <w:r>
-              <w:rPr>
-                <w:rFonts w:cstheme="minorHAnsi"/>
-                <w:b/>
-                <w:bCs/>
-                <w:lang w:val="en-US"/>
-              </w:rPr>
-              <w:t>Mã Nhân Viên</w:t>
-            </w:r>
-          </w:p>
-        </w:tc>
-        <w:tc>
-          <w:tcPr>
-            <w:tcW w:w="1288" w:type="dxa"/>
-          </w:tcPr>
-          <w:p>
-            <w:pPr>
+            <w:tcW w:w="1307" w:type="dxa"/>
+            <w:vAlign w:val="center"/>
+          </w:tcPr>
+          <w:p>
+            <w:pPr>
+              <w:spacing w:before="240"/>
+              <w:rPr>
+                <w:rFonts w:cstheme="minorHAnsi"/>
+                <w:b/>
+                <w:bCs/>
+                <w:lang w:val="en-US"/>
+              </w:rPr>
+            </w:pPr>
+            <w:r>
+              <w:rPr>
+                <w:rFonts w:cstheme="minorHAnsi"/>
+                <w:b/>
+                <w:bCs/>
+                <w:lang w:val="en-US"/>
+              </w:rPr>
+              <w:t>Mã</w:t>
+            </w:r>
+          </w:p>
+        </w:tc>
+        <w:tc>
+          <w:tcPr>
+            <w:tcW w:w="1307" w:type="dxa"/>
+            <w:vAlign w:val="center"/>
+          </w:tcPr>
+          <w:p>
+            <w:pPr>
+              <w:spacing w:before="240"/>
               <w:rPr>
                 <w:rFonts w:cstheme="minorHAnsi"/>
                 <w:b/>
@@ -126,10 +132,12 @@
         </w:tc>
         <w:tc>
           <w:tcPr>
-            <w:tcW w:w="1275" w:type="dxa"/>
-          </w:tcPr>
-          <w:p>
-            <w:pPr>
+            <w:tcW w:w="1307" w:type="dxa"/>
+            <w:vAlign w:val="center"/>
+          </w:tcPr>
+          <w:p>
+            <w:pPr>
+              <w:spacing w:before="240"/>
               <w:rPr>
                 <w:rFonts w:cstheme="minorHAnsi"/>
                 <w:b/>
@@ -150,10 +158,12 @@
         </w:tc>
         <w:tc>
           <w:tcPr>
-            <w:tcW w:w="1355" w:type="dxa"/>
-          </w:tcPr>
-          <w:p>
-            <w:pPr>
+            <w:tcW w:w="1307" w:type="dxa"/>
+            <w:vAlign w:val="center"/>
+          </w:tcPr>
+          <w:p>
+            <w:pPr>
+              <w:spacing w:before="240"/>
               <w:rPr>
                 <w:rFonts w:cstheme="minorHAnsi"/>
                 <w:b/>
@@ -174,10 +184,12 @@
         </w:tc>
         <w:tc>
           <w:tcPr>
-            <w:tcW w:w="1355" w:type="dxa"/>
-          </w:tcPr>
-          <w:p>
-            <w:pPr>
+            <w:tcW w:w="977" w:type="dxa"/>
+            <w:vAlign w:val="center"/>
+          </w:tcPr>
+          <w:p>
+            <w:pPr>
+              <w:spacing w:before="240"/>
               <w:rPr>
                 <w:rFonts w:cstheme="minorHAnsi"/>
                 <w:b/>
@@ -198,34 +210,47 @@
         </w:tc>
         <w:tc>
           <w:tcPr>
-            <w:tcW w:w="1492" w:type="dxa"/>
-          </w:tcPr>
-          <w:p>
-            <w:pPr>
-              <w:rPr>
-                <w:rFonts w:cstheme="minorHAnsi"/>
-                <w:b/>
-                <w:bCs/>
-                <w:lang w:val="en-US"/>
-              </w:rPr>
-            </w:pPr>
-            <w:r>
-              <w:rPr>
-                <w:rFonts w:cstheme="minorHAnsi"/>
-                <w:b/>
-                <w:bCs/>
-                <w:lang w:val="en-US"/>
-              </w:rPr>
-              <w:t>Giờ làm (Theo thái)</w:t>
-            </w:r>
-          </w:p>
-        </w:tc>
-        <w:tc>
-          <w:tcPr>
-            <w:tcW w:w="1175" w:type="dxa"/>
-          </w:tcPr>
-          <w:p>
-            <w:pPr>
+            <w:tcW w:w="1710" w:type="dxa"/>
+            <w:vAlign w:val="center"/>
+          </w:tcPr>
+          <w:p>
+            <w:pPr>
+              <w:spacing w:before="240"/>
+              <w:rPr>
+                <w:rFonts w:cstheme="minorHAnsi"/>
+                <w:b/>
+                <w:bCs/>
+                <w:lang w:val="en-US"/>
+              </w:rPr>
+            </w:pPr>
+            <w:r>
+              <w:rPr>
+                <w:rFonts w:cstheme="minorHAnsi"/>
+                <w:b/>
+                <w:bCs/>
+                <w:lang w:val="en-US"/>
+              </w:rPr>
+              <w:t xml:space="preserve">Giờ làm (Theo </w:t>
+            </w:r>
+            <w:r>
+              <w:rPr>
+                <w:rFonts w:cstheme="minorHAnsi"/>
+                <w:b/>
+                <w:bCs/>
+                <w:lang w:val="en-US"/>
+              </w:rPr>
+              <w:t>tháng)</w:t>
+            </w:r>
+          </w:p>
+        </w:tc>
+        <w:tc>
+          <w:tcPr>
+            <w:tcW w:w="1234" w:type="dxa"/>
+            <w:vAlign w:val="center"/>
+          </w:tcPr>
+          <w:p>
+            <w:pPr>
+              <w:spacing w:before="240"/>
               <w:rPr>
                 <w:rFonts w:cstheme="minorHAnsi"/>
                 <w:b/>
@@ -246,10 +271,12 @@
         </w:tc>
         <w:tc>
           <w:tcPr>
-            <w:tcW w:w="1186" w:type="dxa"/>
-          </w:tcPr>
-          <w:p>
-            <w:pPr>
+            <w:tcW w:w="1307" w:type="dxa"/>
+            <w:vAlign w:val="center"/>
+          </w:tcPr>
+          <w:p>
+            <w:pPr>
+              <w:spacing w:before="240"/>
               <w:rPr>
                 <w:rFonts w:cstheme="minorHAnsi"/>
                 <w:b/>
@@ -265,6 +292,645 @@
                 <w:lang w:val="en-US"/>
               </w:rPr>
               <w:t>Trạng thái</w:t>
+            </w:r>
+          </w:p>
+        </w:tc>
+      </w:tr>
+      <w:tr>
+        <w:tc>
+          <w:tcPr>
+            <w:tcW w:w="1307" w:type="dxa"/>
+            <w:vAlign w:val="center"/>
+          </w:tcPr>
+          <w:p>
+            <w:pPr>
+              <w:spacing w:before="240"/>
+              <w:rPr>
+                <w:rFonts w:cstheme="minorHAnsi"/>
+                <w:b/>
+                <w:bCs/>
+                <w:lang w:val="en-US"/>
+              </w:rPr>
+            </w:pPr>
+            <w:r>
+              <w:rPr>
+                <w:rFonts w:cstheme="minorHAnsi"/>
+                <w:b/>
+                <w:bCs/>
+                <w:lang w:val="en-US"/>
+              </w:rPr>
+              <w:t>E26_001</w:t>
+            </w:r>
+          </w:p>
+        </w:tc>
+        <w:tc>
+          <w:tcPr>
+            <w:tcW w:w="1307" w:type="dxa"/>
+            <w:vAlign w:val="center"/>
+          </w:tcPr>
+          <w:p>
+            <w:pPr>
+              <w:spacing w:before="240"/>
+              <w:rPr>
+                <w:rFonts w:cstheme="minorHAnsi"/>
+                <w:b/>
+                <w:bCs/>
+                <w:lang w:val="en-US"/>
+              </w:rPr>
+            </w:pPr>
+            <w:r>
+              <w:rPr>
+                <w:rFonts w:cstheme="minorHAnsi"/>
+                <w:b/>
+                <w:bCs/>
+                <w:lang w:val="en-US"/>
+              </w:rPr>
+              <w:t>DTG Bảo</w:t>
+            </w:r>
+          </w:p>
+        </w:tc>
+        <w:tc>
+          <w:tcPr>
+            <w:tcW w:w="1307" w:type="dxa"/>
+            <w:vAlign w:val="center"/>
+          </w:tcPr>
+          <w:p>
+            <w:pPr>
+              <w:spacing w:before="240"/>
+              <w:rPr>
+                <w:rFonts w:cstheme="minorHAnsi"/>
+                <w:b/>
+                <w:bCs/>
+                <w:lang w:val="en-US"/>
+              </w:rPr>
+            </w:pPr>
+            <w:r>
+              <w:rPr>
+                <w:rFonts w:cstheme="minorHAnsi"/>
+                <w:b/>
+                <w:bCs/>
+                <w:lang w:val="en-US"/>
+              </w:rPr>
+              <w:t>Quản Lí</w:t>
+            </w:r>
+          </w:p>
+        </w:tc>
+        <w:tc>
+          <w:tcPr>
+            <w:tcW w:w="1307" w:type="dxa"/>
+            <w:vAlign w:val="center"/>
+          </w:tcPr>
+          <w:p>
+            <w:pPr>
+              <w:spacing w:before="240"/>
+              <w:rPr>
+                <w:rFonts w:cstheme="minorHAnsi"/>
+                <w:b/>
+                <w:bCs/>
+                <w:lang w:val="en-US"/>
+              </w:rPr>
+            </w:pPr>
+            <w:r>
+              <w:rPr>
+                <w:rFonts w:cstheme="minorHAnsi"/>
+                <w:b/>
+                <w:bCs/>
+                <w:lang w:val="en-US"/>
+              </w:rPr>
+              <w:t>Cố định</w:t>
+            </w:r>
+          </w:p>
+        </w:tc>
+        <w:tc>
+          <w:tcPr>
+            <w:tcW w:w="977" w:type="dxa"/>
+            <w:vAlign w:val="center"/>
+          </w:tcPr>
+          <w:p>
+            <w:pPr>
+              <w:spacing w:before="240"/>
+              <w:rPr>
+                <w:rFonts w:cstheme="minorHAnsi"/>
+                <w:b/>
+                <w:bCs/>
+                <w:lang w:val="en-US"/>
+              </w:rPr>
+            </w:pPr>
+            <w:r>
+              <w:rPr>
+                <w:rFonts w:cstheme="minorHAnsi"/>
+                <w:b/>
+                <w:bCs/>
+                <w:lang w:val="en-US"/>
+              </w:rPr>
+              <w:t>10tr</w:t>
+            </w:r>
+            <w:r>
+              <w:rPr>
+                <w:rFonts w:cstheme="minorHAnsi"/>
+                <w:b/>
+                <w:bCs/>
+                <w:lang w:val="en-US"/>
+              </w:rPr>
+              <w:t>/th</w:t>
+            </w:r>
+          </w:p>
+        </w:tc>
+        <w:tc>
+          <w:tcPr>
+            <w:tcW w:w="1710" w:type="dxa"/>
+            <w:vAlign w:val="center"/>
+          </w:tcPr>
+          <w:p>
+            <w:pPr>
+              <w:spacing w:before="240"/>
+              <w:rPr>
+                <w:rFonts w:cstheme="minorHAnsi"/>
+                <w:b/>
+                <w:bCs/>
+                <w:lang w:val="en-US"/>
+              </w:rPr>
+            </w:pPr>
+            <w:r>
+              <w:rPr>
+                <w:rFonts w:cstheme="minorHAnsi"/>
+                <w:b/>
+                <w:bCs/>
+                <w:lang w:val="en-US"/>
+              </w:rPr>
+              <w:t>150h</w:t>
+            </w:r>
+          </w:p>
+        </w:tc>
+        <w:tc>
+          <w:tcPr>
+            <w:tcW w:w="1234" w:type="dxa"/>
+            <w:vAlign w:val="center"/>
+          </w:tcPr>
+          <w:p>
+            <w:pPr>
+              <w:spacing w:before="240"/>
+              <w:rPr>
+                <w:rFonts w:cstheme="minorHAnsi"/>
+                <w:b/>
+                <w:bCs/>
+                <w:lang w:val="en-US"/>
+              </w:rPr>
+            </w:pPr>
+            <w:r>
+              <w:rPr>
+                <w:rFonts w:cstheme="minorHAnsi"/>
+                <w:b/>
+                <w:bCs/>
+                <w:lang w:val="en-US"/>
+              </w:rPr>
+              <w:t>12345</w:t>
+            </w:r>
+          </w:p>
+        </w:tc>
+        <w:tc>
+          <w:tcPr>
+            <w:tcW w:w="1307" w:type="dxa"/>
+            <w:vAlign w:val="center"/>
+          </w:tcPr>
+          <w:p>
+            <w:pPr>
+              <w:spacing w:before="240"/>
+              <w:rPr>
+                <w:rFonts w:cstheme="minorHAnsi"/>
+                <w:b/>
+                <w:bCs/>
+                <w:lang w:val="en-US"/>
+              </w:rPr>
+            </w:pPr>
+            <w:r>
+              <w:rPr>
+                <w:rFonts w:cstheme="minorHAnsi"/>
+                <w:b/>
+                <w:bCs/>
+                <w:lang w:val="en-US"/>
+              </w:rPr>
+              <w:t>Còn Làm</w:t>
+            </w:r>
+          </w:p>
+        </w:tc>
+      </w:tr>
+      <w:tr>
+        <w:tc>
+          <w:tcPr>
+            <w:tcW w:w="1307" w:type="dxa"/>
+            <w:vAlign w:val="center"/>
+          </w:tcPr>
+          <w:p>
+            <w:pPr>
+              <w:spacing w:before="240"/>
+              <w:rPr>
+                <w:rFonts w:cstheme="minorHAnsi"/>
+                <w:b/>
+                <w:bCs/>
+                <w:lang w:val="en-US"/>
+              </w:rPr>
+            </w:pPr>
+            <w:r>
+              <w:rPr>
+                <w:rFonts w:cstheme="minorHAnsi"/>
+                <w:b/>
+                <w:bCs/>
+                <w:lang w:val="en-US"/>
+              </w:rPr>
+              <w:t>E26_002</w:t>
+            </w:r>
+          </w:p>
+        </w:tc>
+        <w:tc>
+          <w:tcPr>
+            <w:tcW w:w="1307" w:type="dxa"/>
+            <w:vAlign w:val="center"/>
+          </w:tcPr>
+          <w:p>
+            <w:pPr>
+              <w:spacing w:before="240"/>
+              <w:rPr>
+                <w:rFonts w:cstheme="minorHAnsi"/>
+                <w:b/>
+                <w:bCs/>
+                <w:lang w:val="en-US"/>
+              </w:rPr>
+            </w:pPr>
+            <w:r>
+              <w:rPr>
+                <w:rFonts w:cstheme="minorHAnsi"/>
+                <w:b/>
+                <w:bCs/>
+                <w:lang w:val="en-US"/>
+              </w:rPr>
+              <w:t>NVG Bảo</w:t>
+            </w:r>
+          </w:p>
+        </w:tc>
+        <w:tc>
+          <w:tcPr>
+            <w:tcW w:w="1307" w:type="dxa"/>
+            <w:vAlign w:val="center"/>
+          </w:tcPr>
+          <w:p>
+            <w:pPr>
+              <w:spacing w:before="240"/>
+              <w:rPr>
+                <w:rFonts w:cstheme="minorHAnsi"/>
+                <w:b/>
+                <w:bCs/>
+                <w:lang w:val="en-US"/>
+              </w:rPr>
+            </w:pPr>
+            <w:r>
+              <w:rPr>
+                <w:rFonts w:cstheme="minorHAnsi"/>
+                <w:b/>
+                <w:bCs/>
+                <w:lang w:val="en-US"/>
+              </w:rPr>
+              <w:t>Phụ Hồ</w:t>
+            </w:r>
+          </w:p>
+        </w:tc>
+        <w:tc>
+          <w:tcPr>
+            <w:tcW w:w="1307" w:type="dxa"/>
+            <w:vAlign w:val="center"/>
+          </w:tcPr>
+          <w:p>
+            <w:pPr>
+              <w:spacing w:before="240"/>
+              <w:rPr>
+                <w:rFonts w:cstheme="minorHAnsi"/>
+                <w:b/>
+                <w:bCs/>
+                <w:lang w:val="en-US"/>
+              </w:rPr>
+            </w:pPr>
+            <w:r>
+              <w:rPr>
+                <w:rFonts w:cstheme="minorHAnsi"/>
+                <w:b/>
+                <w:bCs/>
+                <w:lang w:val="en-US"/>
+              </w:rPr>
+              <w:t>Theo giờ</w:t>
+            </w:r>
+          </w:p>
+        </w:tc>
+        <w:tc>
+          <w:tcPr>
+            <w:tcW w:w="977" w:type="dxa"/>
+            <w:vAlign w:val="center"/>
+          </w:tcPr>
+          <w:p>
+            <w:pPr>
+              <w:spacing w:before="240"/>
+              <w:rPr>
+                <w:rFonts w:cstheme="minorHAnsi"/>
+                <w:b/>
+                <w:bCs/>
+                <w:lang w:val="en-US"/>
+              </w:rPr>
+            </w:pPr>
+            <w:r>
+              <w:rPr>
+                <w:rFonts w:cstheme="minorHAnsi"/>
+                <w:b/>
+                <w:bCs/>
+                <w:lang w:val="en-US"/>
+              </w:rPr>
+              <w:t>25k/h</w:t>
+            </w:r>
+          </w:p>
+        </w:tc>
+        <w:tc>
+          <w:tcPr>
+            <w:tcW w:w="1710" w:type="dxa"/>
+            <w:vAlign w:val="center"/>
+          </w:tcPr>
+          <w:p>
+            <w:pPr>
+              <w:spacing w:before="240"/>
+              <w:rPr>
+                <w:rFonts w:cstheme="minorHAnsi"/>
+                <w:b/>
+                <w:bCs/>
+                <w:lang w:val="en-US"/>
+              </w:rPr>
+            </w:pPr>
+            <w:r>
+              <w:rPr>
+                <w:rFonts w:cstheme="minorHAnsi"/>
+                <w:b/>
+                <w:bCs/>
+                <w:lang w:val="en-US"/>
+              </w:rPr>
+              <w:t>90h</w:t>
+            </w:r>
+          </w:p>
+        </w:tc>
+        <w:tc>
+          <w:tcPr>
+            <w:tcW w:w="1234" w:type="dxa"/>
+            <w:vAlign w:val="center"/>
+          </w:tcPr>
+          <w:p>
+            <w:pPr>
+              <w:spacing w:before="240"/>
+              <w:rPr>
+                <w:rFonts w:cstheme="minorHAnsi"/>
+                <w:b/>
+                <w:bCs/>
+                <w:lang w:val="en-US"/>
+              </w:rPr>
+            </w:pPr>
+            <w:r>
+              <w:rPr>
+                <w:rFonts w:cstheme="minorHAnsi"/>
+                <w:b/>
+                <w:bCs/>
+                <w:lang w:val="en-US"/>
+              </w:rPr>
+              <w:t>12346</w:t>
+            </w:r>
+          </w:p>
+        </w:tc>
+        <w:tc>
+          <w:tcPr>
+            <w:tcW w:w="1307" w:type="dxa"/>
+            <w:vAlign w:val="center"/>
+          </w:tcPr>
+          <w:p>
+            <w:pPr>
+              <w:spacing w:before="240"/>
+              <w:rPr>
+                <w:rFonts w:cstheme="minorHAnsi"/>
+                <w:b/>
+                <w:bCs/>
+                <w:lang w:val="en-US"/>
+              </w:rPr>
+            </w:pPr>
+            <w:r>
+              <w:rPr>
+                <w:rFonts w:cstheme="minorHAnsi"/>
+                <w:b/>
+                <w:bCs/>
+                <w:lang w:val="en-US"/>
+              </w:rPr>
+              <w:t>Còn làm</w:t>
+            </w:r>
+          </w:p>
+        </w:tc>
+      </w:tr>
+      <w:tr>
+        <w:tc>
+          <w:tcPr>
+            <w:tcW w:w="1307" w:type="dxa"/>
+            <w:vAlign w:val="center"/>
+          </w:tcPr>
+          <w:p>
+            <w:pPr>
+              <w:spacing w:before="240"/>
+              <w:rPr>
+                <w:rFonts w:cstheme="minorHAnsi"/>
+                <w:b/>
+                <w:bCs/>
+                <w:lang w:val="en-US"/>
+              </w:rPr>
+            </w:pPr>
+            <w:r>
+              <w:rPr>
+                <w:rFonts w:cstheme="minorHAnsi"/>
+                <w:b/>
+                <w:bCs/>
+                <w:lang w:val="en-US"/>
+              </w:rPr>
+              <w:t>E26_003</w:t>
+            </w:r>
+          </w:p>
+        </w:tc>
+        <w:tc>
+          <w:tcPr>
+            <w:tcW w:w="1307" w:type="dxa"/>
+            <w:vAlign w:val="center"/>
+          </w:tcPr>
+          <w:p>
+            <w:pPr>
+              <w:spacing w:before="240"/>
+              <w:rPr>
+                <w:rFonts w:cstheme="minorHAnsi"/>
+                <w:b/>
+                <w:bCs/>
+                <w:lang w:val="en-US"/>
+              </w:rPr>
+            </w:pPr>
+            <w:r>
+              <w:rPr>
+                <w:rFonts w:cstheme="minorHAnsi"/>
+                <w:b/>
+                <w:bCs/>
+                <w:lang w:val="en-US"/>
+              </w:rPr>
+              <w:t>TT Đạt</w:t>
+            </w:r>
+          </w:p>
+        </w:tc>
+        <w:tc>
+          <w:tcPr>
+            <w:tcW w:w="1307" w:type="dxa"/>
+            <w:vAlign w:val="center"/>
+          </w:tcPr>
+          <w:p>
+            <w:pPr>
+              <w:spacing w:before="240"/>
+              <w:rPr>
+                <w:rFonts w:cstheme="minorHAnsi"/>
+                <w:b/>
+                <w:bCs/>
+                <w:lang w:val="en-US"/>
+              </w:rPr>
+            </w:pPr>
+            <w:r>
+              <w:rPr>
+                <w:rFonts w:cstheme="minorHAnsi"/>
+                <w:b/>
+                <w:bCs/>
+                <w:lang w:val="en-US"/>
+              </w:rPr>
+              <w:t>Xúc Cát</w:t>
+            </w:r>
+          </w:p>
+        </w:tc>
+        <w:tc>
+          <w:tcPr>
+            <w:tcW w:w="1307" w:type="dxa"/>
+            <w:vAlign w:val="center"/>
+          </w:tcPr>
+          <w:p>
+            <w:pPr>
+              <w:spacing w:before="240"/>
+              <w:rPr>
+                <w:rFonts w:cstheme="minorHAnsi"/>
+                <w:b/>
+                <w:bCs/>
+                <w:lang w:val="en-US"/>
+              </w:rPr>
+            </w:pPr>
+            <w:r>
+              <w:rPr>
+                <w:rFonts w:cstheme="minorHAnsi"/>
+                <w:b/>
+                <w:bCs/>
+                <w:lang w:val="en-US"/>
+              </w:rPr>
+              <w:t>Cố định</w:t>
+            </w:r>
+          </w:p>
+        </w:tc>
+        <w:tc>
+          <w:tcPr>
+            <w:tcW w:w="977" w:type="dxa"/>
+            <w:vAlign w:val="center"/>
+          </w:tcPr>
+          <w:p>
+            <w:pPr>
+              <w:spacing w:before="240"/>
+              <w:rPr>
+                <w:rFonts w:cstheme="minorHAnsi"/>
+                <w:b/>
+                <w:bCs/>
+                <w:lang w:val="en-US"/>
+              </w:rPr>
+            </w:pPr>
+            <w:r>
+              <w:rPr>
+                <w:rFonts w:cstheme="minorHAnsi"/>
+                <w:b/>
+                <w:bCs/>
+                <w:lang w:val="en-US"/>
+              </w:rPr>
+              <w:t>8tr/th</w:t>
+            </w:r>
+          </w:p>
+        </w:tc>
+        <w:tc>
+          <w:tcPr>
+            <w:tcW w:w="1710" w:type="dxa"/>
+            <w:vAlign w:val="center"/>
+          </w:tcPr>
+          <w:p>
+            <w:pPr>
+              <w:spacing w:before="240"/>
+              <w:rPr>
+                <w:rFonts w:cstheme="minorHAnsi"/>
+                <w:b/>
+                <w:bCs/>
+                <w:lang w:val="en-US"/>
+              </w:rPr>
+            </w:pPr>
+            <w:r>
+              <w:rPr>
+                <w:rFonts w:cstheme="minorHAnsi"/>
+                <w:b/>
+                <w:bCs/>
+                <w:lang w:val="en-US"/>
+              </w:rPr>
+              <w:t>150h</w:t>
+            </w:r>
+          </w:p>
+        </w:tc>
+        <w:tc>
+          <w:tcPr>
+            <w:tcW w:w="1234" w:type="dxa"/>
+            <w:vAlign w:val="center"/>
+          </w:tcPr>
+          <w:p>
+            <w:pPr>
+              <w:spacing w:before="240"/>
+              <w:rPr>
+                <w:rFonts w:cstheme="minorHAnsi"/>
+                <w:b/>
+                <w:bCs/>
+                <w:lang w:val="en-US"/>
+              </w:rPr>
+            </w:pPr>
+            <w:r>
+              <w:rPr>
+                <w:rFonts w:cstheme="minorHAnsi"/>
+                <w:b/>
+                <w:bCs/>
+                <w:lang w:val="en-US"/>
+              </w:rPr>
+              <w:t>12347</w:t>
+            </w:r>
+          </w:p>
+        </w:tc>
+        <w:tc>
+          <w:tcPr>
+            <w:tcW w:w="1307" w:type="dxa"/>
+            <w:vAlign w:val="center"/>
+          </w:tcPr>
+          <w:p>
+            <w:pPr>
+              <w:spacing w:before="240"/>
+              <w:rPr>
+                <w:rFonts w:cstheme="minorHAnsi"/>
+                <w:b/>
+                <w:bCs/>
+                <w:lang w:val="en-US"/>
+              </w:rPr>
+            </w:pPr>
+            <w:r>
+              <w:rPr>
+                <w:rFonts w:cstheme="minorHAnsi"/>
+                <w:b/>
+                <w:bCs/>
+                <w:lang w:val="en-US"/>
+              </w:rPr>
+              <w:t>Đã nghỉ</w:t>
             </w:r>
           </w:p>
         </w:tc>
@@ -276,6 +942,604 @@
           <w:b/>
           <w:bCs/>
           <w:sz w:val="36"/>
+          <w:lang w:val="en-US"/>
+        </w:rPr>
+      </w:pPr>
+    </w:p>
+    <w:p>
+      <w:pPr>
+        <w:rPr>
+          <w:b/>
+          <w:bCs/>
+          <w:sz w:val="28"/>
+          <w:szCs w:val="28"/>
+          <w:lang w:val="en-US"/>
+        </w:rPr>
+      </w:pPr>
+      <w:r>
+        <w:rPr>
+          <w:b/>
+          <w:bCs/>
+          <w:sz w:val="28"/>
+          <w:szCs w:val="28"/>
+          <w:lang w:val="en-US"/>
+        </w:rPr>
+        <w:t>+ Chức năng :</w:t>
+      </w:r>
+    </w:p>
+    <w:p>
+      <w:pPr>
+        <w:pStyle w:val="ListParagraph"/>
+        <w:numPr>
+          <w:ilvl w:val="0"/>
+          <w:numId w:val="1"/>
+        </w:numPr>
+        <w:spacing w:line="360" w:lineRule="auto"/>
+        <w:rPr>
+          <w:b/>
+          <w:bCs/>
+          <w:sz w:val="28"/>
+          <w:lang w:val="en-US"/>
+        </w:rPr>
+      </w:pPr>
+      <w:r>
+        <w:rPr>
+          <w:b/>
+          <w:bCs/>
+          <w:sz w:val="28"/>
+          <w:lang w:val="en-US"/>
+        </w:rPr>
+        <w:t xml:space="preserve">Thêm : Dấu * là bắt buộc </w:t>
+      </w:r>
+    </w:p>
+    <w:p>
+      <w:pPr>
+        <w:pStyle w:val="ListParagraph"/>
+        <w:numPr>
+          <w:ilvl w:val="1"/>
+          <w:numId w:val="1"/>
+        </w:numPr>
+        <w:spacing w:line="360" w:lineRule="auto"/>
+        <w:rPr>
+          <w:b/>
+          <w:bCs/>
+          <w:sz w:val="28"/>
+          <w:lang w:val="en-US"/>
+        </w:rPr>
+      </w:pPr>
+      <w:r>
+        <w:rPr>
+          <w:b/>
+          <w:bCs/>
+          <w:sz w:val="28"/>
+          <w:lang w:val="en-US"/>
+        </w:rPr>
+        <w:t xml:space="preserve">Họ tên* </w:t>
+      </w:r>
+    </w:p>
+    <w:p>
+      <w:pPr>
+        <w:pStyle w:val="ListParagraph"/>
+        <w:numPr>
+          <w:ilvl w:val="1"/>
+          <w:numId w:val="1"/>
+        </w:numPr>
+        <w:spacing w:line="360" w:lineRule="auto"/>
+        <w:rPr>
+          <w:b/>
+          <w:bCs/>
+          <w:sz w:val="28"/>
+          <w:lang w:val="en-US"/>
+        </w:rPr>
+      </w:pPr>
+      <w:r>
+        <w:rPr>
+          <w:b/>
+          <w:bCs/>
+          <w:sz w:val="28"/>
+          <w:lang w:val="en-US"/>
+        </w:rPr>
+        <w:t>Vai trò*</w:t>
+      </w:r>
+    </w:p>
+    <w:p>
+      <w:pPr>
+        <w:pStyle w:val="ListParagraph"/>
+        <w:numPr>
+          <w:ilvl w:val="1"/>
+          <w:numId w:val="1"/>
+        </w:numPr>
+        <w:spacing w:line="360" w:lineRule="auto"/>
+        <w:rPr>
+          <w:b/>
+          <w:bCs/>
+          <w:sz w:val="28"/>
+          <w:lang w:val="en-US"/>
+        </w:rPr>
+      </w:pPr>
+      <w:r>
+        <w:rPr>
+          <w:b/>
+          <w:bCs/>
+          <w:sz w:val="28"/>
+          <w:lang w:val="en-US"/>
+        </w:rPr>
+        <w:t xml:space="preserve">Giới tính </w:t>
+      </w:r>
+    </w:p>
+    <w:p>
+      <w:pPr>
+        <w:pStyle w:val="ListParagraph"/>
+        <w:numPr>
+          <w:ilvl w:val="1"/>
+          <w:numId w:val="1"/>
+        </w:numPr>
+        <w:spacing w:line="360" w:lineRule="auto"/>
+        <w:rPr>
+          <w:b/>
+          <w:bCs/>
+          <w:sz w:val="28"/>
+          <w:lang w:val="en-US"/>
+        </w:rPr>
+      </w:pPr>
+      <w:r>
+        <w:rPr>
+          <w:b/>
+          <w:bCs/>
+          <w:sz w:val="28"/>
+          <w:lang w:val="en-US"/>
+        </w:rPr>
+        <w:t xml:space="preserve">Số điện thoại*  </w:t>
+      </w:r>
+    </w:p>
+    <w:p>
+      <w:pPr>
+        <w:pStyle w:val="ListParagraph"/>
+        <w:numPr>
+          <w:ilvl w:val="1"/>
+          <w:numId w:val="1"/>
+        </w:numPr>
+        <w:spacing w:line="360" w:lineRule="auto"/>
+        <w:rPr>
+          <w:b/>
+          <w:bCs/>
+          <w:sz w:val="28"/>
+          <w:lang w:val="en-US"/>
+        </w:rPr>
+      </w:pPr>
+      <w:r>
+        <w:rPr>
+          <w:b/>
+          <w:bCs/>
+          <w:sz w:val="28"/>
+          <w:lang w:val="en-US"/>
+        </w:rPr>
+        <w:t>Địa chỉ</w:t>
+      </w:r>
+    </w:p>
+    <w:p>
+      <w:pPr>
+        <w:pStyle w:val="ListParagraph"/>
+        <w:numPr>
+          <w:ilvl w:val="1"/>
+          <w:numId w:val="1"/>
+        </w:numPr>
+        <w:spacing w:line="360" w:lineRule="auto"/>
+        <w:rPr>
+          <w:b/>
+          <w:bCs/>
+          <w:sz w:val="28"/>
+          <w:lang w:val="en-US"/>
+        </w:rPr>
+      </w:pPr>
+      <w:r>
+        <w:rPr>
+          <w:b/>
+          <w:bCs/>
+          <w:sz w:val="28"/>
+          <w:lang w:val="en-US"/>
+        </w:rPr>
+        <w:t xml:space="preserve">CCCD* </w:t>
+      </w:r>
+    </w:p>
+    <w:p>
+      <w:pPr>
+        <w:pStyle w:val="ListParagraph"/>
+        <w:numPr>
+          <w:ilvl w:val="1"/>
+          <w:numId w:val="1"/>
+        </w:numPr>
+        <w:spacing w:line="360" w:lineRule="auto"/>
+        <w:rPr>
+          <w:b/>
+          <w:bCs/>
+          <w:sz w:val="28"/>
+          <w:lang w:val="en-US"/>
+        </w:rPr>
+      </w:pPr>
+      <w:r>
+        <w:rPr>
+          <w:b/>
+          <w:bCs/>
+          <w:sz w:val="28"/>
+          <w:lang w:val="en-US"/>
+        </w:rPr>
+        <w:t xml:space="preserve">Loại lương* (Cố định hay theo giờ), </w:t>
+      </w:r>
+    </w:p>
+    <w:p>
+      <w:pPr>
+        <w:pStyle w:val="ListParagraph"/>
+        <w:numPr>
+          <w:ilvl w:val="1"/>
+          <w:numId w:val="1"/>
+        </w:numPr>
+        <w:spacing w:line="360" w:lineRule="auto"/>
+        <w:rPr>
+          <w:b/>
+          <w:bCs/>
+          <w:sz w:val="28"/>
+          <w:lang w:val="en-US"/>
+        </w:rPr>
+      </w:pPr>
+      <w:r>
+        <w:rPr>
+          <w:b/>
+          <w:bCs/>
+          <w:sz w:val="28"/>
+          <w:lang w:val="en-US"/>
+        </w:rPr>
+        <w:t>Lương* (25k/h part time và 6 triệu full time)</w:t>
+      </w:r>
+    </w:p>
+    <w:p>
+      <w:pPr>
+        <w:pStyle w:val="ListParagraph"/>
+        <w:numPr>
+          <w:ilvl w:val="1"/>
+          <w:numId w:val="1"/>
+        </w:numPr>
+        <w:spacing w:line="360" w:lineRule="auto"/>
+        <w:rPr>
+          <w:b/>
+          <w:bCs/>
+          <w:sz w:val="28"/>
+          <w:lang w:val="en-US"/>
+        </w:rPr>
+      </w:pPr>
+      <w:r>
+        <w:rPr>
+          <w:b/>
+          <w:bCs/>
+          <w:sz w:val="28"/>
+          <w:lang w:val="en-US"/>
+        </w:rPr>
+        <w:t xml:space="preserve">Tài khoản: Tự động tạo  </w:t>
+      </w:r>
+    </w:p>
+    <w:p>
+      <w:pPr>
+        <w:pStyle w:val="ListParagraph"/>
+        <w:numPr>
+          <w:ilvl w:val="1"/>
+          <w:numId w:val="1"/>
+        </w:numPr>
+        <w:spacing w:line="360" w:lineRule="auto"/>
+        <w:rPr>
+          <w:b/>
+          <w:bCs/>
+          <w:sz w:val="28"/>
+          <w:lang w:val="en-US"/>
+        </w:rPr>
+      </w:pPr>
+      <w:r>
+        <w:rPr>
+          <w:b/>
+          <w:bCs/>
+          <w:sz w:val="28"/>
+          <w:lang w:val="en-US"/>
+        </w:rPr>
+        <w:t>Mật khẩu: Tự động tạo</w:t>
+      </w:r>
+    </w:p>
+    <w:p>
+      <w:pPr>
+        <w:pStyle w:val="ListParagraph"/>
+        <w:numPr>
+          <w:ilvl w:val="0"/>
+          <w:numId w:val="1"/>
+        </w:numPr>
+        <w:spacing w:line="360" w:lineRule="auto"/>
+        <w:rPr>
+          <w:b/>
+          <w:bCs/>
+          <w:sz w:val="28"/>
+          <w:lang w:val="en-US"/>
+        </w:rPr>
+      </w:pPr>
+      <w:r>
+        <w:rPr>
+          <w:b/>
+          <w:bCs/>
+          <w:sz w:val="28"/>
+          <w:lang w:val="en-US"/>
+        </w:rPr>
+        <w:t xml:space="preserve">Sửa </w:t>
+      </w:r>
+      <w:r>
+        <w:rPr>
+          <w:b/>
+          <w:bCs/>
+          <w:sz w:val="28"/>
+          <w:lang w:val="en-US"/>
+        </w:rPr>
+        <w:t xml:space="preserve">: Các thông tin trên </w:t>
+      </w:r>
+    </w:p>
+    <w:p>
+      <w:pPr>
+        <w:pStyle w:val="ListParagraph"/>
+        <w:numPr>
+          <w:ilvl w:val="0"/>
+          <w:numId w:val="1"/>
+        </w:numPr>
+        <w:spacing w:line="360" w:lineRule="auto"/>
+        <w:rPr>
+          <w:b/>
+          <w:bCs/>
+          <w:sz w:val="28"/>
+          <w:lang w:val="en-US"/>
+        </w:rPr>
+      </w:pPr>
+      <w:r>
+        <w:rPr>
+          <w:b/>
+          <w:bCs/>
+          <w:sz w:val="28"/>
+          <w:lang w:val="en-US"/>
+        </w:rPr>
+        <w:t>Xóa : Xác nhận trước khi xóa</w:t>
+      </w:r>
+    </w:p>
+    <w:p>
+      <w:pPr>
+        <w:pStyle w:val="ListParagraph"/>
+        <w:numPr>
+          <w:ilvl w:val="0"/>
+          <w:numId w:val="1"/>
+        </w:numPr>
+        <w:spacing w:line="360" w:lineRule="auto"/>
+        <w:rPr>
+          <w:b/>
+          <w:bCs/>
+          <w:sz w:val="28"/>
+          <w:lang w:val="en-US"/>
+        </w:rPr>
+      </w:pPr>
+      <w:r>
+        <w:rPr>
+          <w:b/>
+          <w:bCs/>
+          <w:sz w:val="28"/>
+          <w:lang w:val="en-US"/>
+        </w:rPr>
+        <w:t>Tìm kiếm theo tên</w:t>
+      </w:r>
+      <w:r>
+        <w:rPr>
+          <w:b/>
+          <w:bCs/>
+          <w:sz w:val="28"/>
+          <w:lang w:val="en-US"/>
+        </w:rPr>
+        <w:t xml:space="preserve">: </w:t>
+      </w:r>
+    </w:p>
+    <w:p>
+      <w:pPr>
+        <w:pStyle w:val="ListParagraph"/>
+        <w:numPr>
+          <w:ilvl w:val="0"/>
+          <w:numId w:val="1"/>
+        </w:numPr>
+        <w:spacing w:line="360" w:lineRule="auto"/>
+        <w:rPr>
+          <w:b/>
+          <w:bCs/>
+          <w:sz w:val="28"/>
+          <w:lang w:val="en-US"/>
+        </w:rPr>
+      </w:pPr>
+      <w:r>
+        <w:rPr>
+          <w:b/>
+          <w:bCs/>
+          <w:sz w:val="28"/>
+          <w:lang w:val="en-US"/>
+        </w:rPr>
+        <w:t>Lọc theo vai trò, giới tính: tạo nút check box</w:t>
+      </w:r>
+    </w:p>
+    <w:p>
+      <w:pPr>
+        <w:pStyle w:val="ListParagraph"/>
+        <w:numPr>
+          <w:ilvl w:val="1"/>
+          <w:numId w:val="1"/>
+        </w:numPr>
+        <w:spacing w:line="360" w:lineRule="auto"/>
+        <w:rPr>
+          <w:b/>
+          <w:bCs/>
+          <w:sz w:val="28"/>
+          <w:lang w:val="en-US"/>
+        </w:rPr>
+      </w:pPr>
+      <w:r>
+        <w:rPr>
+          <w:b/>
+          <w:bCs/>
+          <w:sz w:val="28"/>
+          <w:lang w:val="en-US"/>
+        </w:rPr>
+        <w:t xml:space="preserve">Quản lí </w:t>
+      </w:r>
+    </w:p>
+    <w:p>
+      <w:pPr>
+        <w:pStyle w:val="ListParagraph"/>
+        <w:numPr>
+          <w:ilvl w:val="1"/>
+          <w:numId w:val="1"/>
+        </w:numPr>
+        <w:spacing w:line="360" w:lineRule="auto"/>
+        <w:rPr>
+          <w:b/>
+          <w:bCs/>
+          <w:sz w:val="28"/>
+          <w:lang w:val="en-US"/>
+        </w:rPr>
+      </w:pPr>
+      <w:r>
+        <w:rPr>
+          <w:b/>
+          <w:bCs/>
+          <w:sz w:val="28"/>
+          <w:lang w:val="en-US"/>
+        </w:rPr>
+        <w:t xml:space="preserve">Phụ hồ </w:t>
+      </w:r>
+    </w:p>
+    <w:p>
+      <w:pPr>
+        <w:pStyle w:val="ListParagraph"/>
+        <w:numPr>
+          <w:ilvl w:val="1"/>
+          <w:numId w:val="1"/>
+        </w:numPr>
+        <w:spacing w:line="360" w:lineRule="auto"/>
+        <w:rPr>
+          <w:b/>
+          <w:bCs/>
+          <w:sz w:val="28"/>
+          <w:lang w:val="en-US"/>
+        </w:rPr>
+      </w:pPr>
+      <w:r>
+        <w:rPr>
+          <w:b/>
+          <w:bCs/>
+          <w:sz w:val="28"/>
+          <w:lang w:val="en-US"/>
+        </w:rPr>
+        <w:t>Xúc cát</w:t>
+      </w:r>
+    </w:p>
+    <w:p>
+      <w:pPr>
+        <w:pStyle w:val="ListParagraph"/>
+        <w:numPr>
+          <w:ilvl w:val="1"/>
+          <w:numId w:val="1"/>
+        </w:numPr>
+        <w:spacing w:line="360" w:lineRule="auto"/>
+        <w:rPr>
+          <w:b/>
+          <w:bCs/>
+          <w:sz w:val="28"/>
+          <w:lang w:val="en-US"/>
+        </w:rPr>
+      </w:pPr>
+      <w:r>
+        <w:rPr>
+          <w:b/>
+          <w:bCs/>
+          <w:sz w:val="28"/>
+          <w:lang w:val="en-US"/>
+        </w:rPr>
+        <w:t>Nam</w:t>
+      </w:r>
+    </w:p>
+    <w:p>
+      <w:pPr>
+        <w:pStyle w:val="ListParagraph"/>
+        <w:numPr>
+          <w:ilvl w:val="1"/>
+          <w:numId w:val="1"/>
+        </w:numPr>
+        <w:spacing w:line="360" w:lineRule="auto"/>
+        <w:rPr>
+          <w:b/>
+          <w:bCs/>
+          <w:sz w:val="28"/>
+          <w:lang w:val="en-US"/>
+        </w:rPr>
+      </w:pPr>
+      <w:r>
+        <w:rPr>
+          <w:b/>
+          <w:bCs/>
+          <w:sz w:val="28"/>
+          <w:lang w:val="en-US"/>
+        </w:rPr>
+        <w:t>Nữ</w:t>
+      </w:r>
+    </w:p>
+    <w:p>
+      <w:pPr>
+        <w:pStyle w:val="ListParagraph"/>
+        <w:numPr>
+          <w:ilvl w:val="0"/>
+          <w:numId w:val="1"/>
+        </w:numPr>
+        <w:spacing w:line="360" w:lineRule="auto"/>
+        <w:rPr>
+          <w:b/>
+          <w:bCs/>
+          <w:sz w:val="28"/>
+          <w:lang w:val="en-US"/>
+        </w:rPr>
+      </w:pPr>
+      <w:r>
+        <w:rPr>
+          <w:b/>
+          <w:bCs/>
+          <w:sz w:val="28"/>
+          <w:lang w:val="en-US"/>
+        </w:rPr>
+        <w:lastRenderedPageBreak/>
+        <w:t xml:space="preserve">Sắp xếp theo mã nhân viên, tên </w:t>
+      </w:r>
+    </w:p>
+    <w:p>
+      <w:pPr>
+        <w:spacing w:line="360" w:lineRule="auto"/>
+        <w:rPr>
+          <w:b/>
+          <w:bCs/>
+          <w:sz w:val="28"/>
+          <w:lang w:val="en-US"/>
+        </w:rPr>
+      </w:pPr>
+    </w:p>
+    <w:p>
+      <w:pPr>
+        <w:spacing w:line="360" w:lineRule="auto"/>
+        <w:rPr>
+          <w:b/>
+          <w:bCs/>
+          <w:sz w:val="28"/>
+          <w:lang w:val="en-US"/>
+        </w:rPr>
+      </w:pPr>
+    </w:p>
+    <w:p>
+      <w:pPr>
+        <w:spacing w:line="360" w:lineRule="auto"/>
+        <w:rPr>
+          <w:b/>
+          <w:bCs/>
+          <w:sz w:val="28"/>
           <w:lang w:val="en-US"/>
         </w:rPr>
       </w:pPr>
@@ -288,6 +1552,127 @@
     </w:sectPr>
   </w:body>
 </w:document>
+</file>
+
+<file path=word/numbering.xml><?xml version="1.0" encoding="utf-8"?>
+<w:numbering xmlns:wpc="http://schemas.microsoft.com/office/word/2010/wordprocessingCanvas" xmlns:cx="http://schemas.microsoft.com/office/drawing/2014/chartex" xmlns:cx1="http://schemas.microsoft.com/office/drawing/2015/9/8/chartex" xmlns:cx2="http://schemas.microsoft.com/office/drawing/2015/10/21/chartex" xmlns:cx3="http://schemas.microsoft.com/office/drawing/2016/5/9/chartex" xmlns:cx4="http://schemas.microsoft.com/office/drawing/2016/5/10/chartex" xmlns:cx5="http://schemas.microsoft.com/office/drawing/2016/5/11/chartex" xmlns:cx6="http://schemas.microsoft.com/office/drawing/2016/5/12/chartex" xmlns:cx7="http://schemas.microsoft.com/office/drawing/2016/5/13/chartex" xmlns:cx8="http://schemas.microsoft.com/office/drawing/2016/5/14/chartex" xmlns:mc="http://schemas.openxmlformats.org/markup-compatibility/2006" xmlns:aink="http://schemas.microsoft.com/office/drawing/2016/ink" xmlns:am3d="http://schemas.microsoft.com/office/drawing/2017/model3d" xmlns:o="urn:schemas-microsoft-com:office:office" xmlns:oel="http://schemas.microsoft.com/office/2019/extlst" xmlns:r="http://schemas.openxmlformats.org/officeDocument/2006/relationships" xmlns:m="http://schemas.openxmlformats.org/officeDocument/2006/math" xmlns:v="urn:schemas-microsoft-com:vml" xmlns:wp14="http://schemas.microsoft.com/office/word/2010/wordprocessingDrawing" xmlns:wp="http://schemas.openxmlformats.org/drawingml/2006/wordprocessingDrawing" xmlns:w10="urn:schemas-microsoft-com:office:word" xmlns:w="http://schemas.openxmlformats.org/wordprocessingml/2006/main" xmlns:w14="http://schemas.microsoft.com/office/word/2010/wordml" xmlns:w15="http://schemas.microsoft.com/office/word/2012/wordml" xmlns:w16cex="http://schemas.microsoft.com/office/word/2018/wordml/cex" xmlns:w16cid="http://schemas.microsoft.com/office/word/2016/wordml/cid" xmlns:w16="http://schemas.microsoft.com/office/word/2018/wordml" xmlns:w16du="http://schemas.microsoft.com/office/word/2023/wordml/word16du" xmlns:w16sdtdh="http://schemas.microsoft.com/office/word/2020/wordml/sdtdatahash" xmlns:w16sdtfl="http://schemas.microsoft.com/office/word/2024/wordml/sdtformatlock" xmlns:w16se="http://schemas.microsoft.com/office/word/2015/wordml/symex" xmlns:wpg="http://schemas.microsoft.com/office/word/2010/wordprocessingGroup" xmlns:wpi="http://schemas.microsoft.com/office/word/2010/wordprocessingInk" xmlns:wne="http://schemas.microsoft.com/office/word/2006/wordml" xmlns:wps="http://schemas.microsoft.com/office/word/2010/wordprocessingShape" mc:Ignorable="w14 w15 w16se w16cid w16 w16cex w16sdtdh w16sdtfl w16du wp14">
+  <w:abstractNum w:abstractNumId="0" w15:restartNumberingAfterBreak="0">
+    <w:nsid w:val="04491E14"/>
+    <w:multiLevelType w:val="hybridMultilevel"/>
+    <w:tmpl w:val="A8066F4A"/>
+    <w:lvl w:ilvl="0" w:tplc="042A0001">
+      <w:start w:val="1"/>
+      <w:numFmt w:val="bullet"/>
+      <w:lvlText w:val=""/>
+      <w:lvlJc w:val="left"/>
+      <w:pPr>
+        <w:ind w:left="1080" w:hanging="360"/>
+      </w:pPr>
+      <w:rPr>
+        <w:rFonts w:ascii="Symbol" w:hAnsi="Symbol" w:hint="default"/>
+      </w:rPr>
+    </w:lvl>
+    <w:lvl w:ilvl="1" w:tplc="042A0003">
+      <w:start w:val="1"/>
+      <w:numFmt w:val="bullet"/>
+      <w:lvlText w:val="o"/>
+      <w:lvlJc w:val="left"/>
+      <w:pPr>
+        <w:ind w:left="1800" w:hanging="360"/>
+      </w:pPr>
+      <w:rPr>
+        <w:rFonts w:ascii="Courier New" w:hAnsi="Courier New" w:cs="Courier New" w:hint="default"/>
+      </w:rPr>
+    </w:lvl>
+    <w:lvl w:ilvl="2" w:tplc="042A0005">
+      <w:start w:val="1"/>
+      <w:numFmt w:val="bullet"/>
+      <w:lvlText w:val=""/>
+      <w:lvlJc w:val="left"/>
+      <w:pPr>
+        <w:ind w:left="2520" w:hanging="360"/>
+      </w:pPr>
+      <w:rPr>
+        <w:rFonts w:ascii="Wingdings" w:hAnsi="Wingdings" w:hint="default"/>
+      </w:rPr>
+    </w:lvl>
+    <w:lvl w:ilvl="3" w:tplc="042A0001">
+      <w:start w:val="1"/>
+      <w:numFmt w:val="bullet"/>
+      <w:lvlText w:val=""/>
+      <w:lvlJc w:val="left"/>
+      <w:pPr>
+        <w:ind w:left="3240" w:hanging="360"/>
+      </w:pPr>
+      <w:rPr>
+        <w:rFonts w:ascii="Symbol" w:hAnsi="Symbol" w:hint="default"/>
+      </w:rPr>
+    </w:lvl>
+    <w:lvl w:ilvl="4" w:tplc="042A0003">
+      <w:start w:val="1"/>
+      <w:numFmt w:val="bullet"/>
+      <w:lvlText w:val="o"/>
+      <w:lvlJc w:val="left"/>
+      <w:pPr>
+        <w:ind w:left="3960" w:hanging="360"/>
+      </w:pPr>
+      <w:rPr>
+        <w:rFonts w:ascii="Courier New" w:hAnsi="Courier New" w:cs="Courier New" w:hint="default"/>
+      </w:rPr>
+    </w:lvl>
+    <w:lvl w:ilvl="5" w:tplc="042A0005">
+      <w:start w:val="1"/>
+      <w:numFmt w:val="bullet"/>
+      <w:lvlText w:val=""/>
+      <w:lvlJc w:val="left"/>
+      <w:pPr>
+        <w:ind w:left="4680" w:hanging="360"/>
+      </w:pPr>
+      <w:rPr>
+        <w:rFonts w:ascii="Wingdings" w:hAnsi="Wingdings" w:hint="default"/>
+      </w:rPr>
+    </w:lvl>
+    <w:lvl w:ilvl="6" w:tplc="042A0001">
+      <w:start w:val="1"/>
+      <w:numFmt w:val="bullet"/>
+      <w:lvlText w:val=""/>
+      <w:lvlJc w:val="left"/>
+      <w:pPr>
+        <w:ind w:left="5400" w:hanging="360"/>
+      </w:pPr>
+      <w:rPr>
+        <w:rFonts w:ascii="Symbol" w:hAnsi="Symbol" w:hint="default"/>
+      </w:rPr>
+    </w:lvl>
+    <w:lvl w:ilvl="7" w:tplc="042A0003">
+      <w:start w:val="1"/>
+      <w:numFmt w:val="bullet"/>
+      <w:lvlText w:val="o"/>
+      <w:lvlJc w:val="left"/>
+      <w:pPr>
+        <w:ind w:left="6120" w:hanging="360"/>
+      </w:pPr>
+      <w:rPr>
+        <w:rFonts w:ascii="Courier New" w:hAnsi="Courier New" w:cs="Courier New" w:hint="default"/>
+      </w:rPr>
+    </w:lvl>
+    <w:lvl w:ilvl="8" w:tplc="042A0005" w:tentative="1">
+      <w:start w:val="1"/>
+      <w:numFmt w:val="bullet"/>
+      <w:lvlText w:val=""/>
+      <w:lvlJc w:val="left"/>
+      <w:pPr>
+        <w:ind w:left="6840" w:hanging="360"/>
+      </w:pPr>
+      <w:rPr>
+        <w:rFonts w:ascii="Wingdings" w:hAnsi="Wingdings" w:hint="default"/>
+      </w:rPr>
+    </w:lvl>
+  </w:abstractNum>
+  <w:num w:numId="1" w16cid:durableId="1183322165">
+    <w:abstractNumId w:val="0"/>
+  </w:num>
+</w:numbering>
 </file>
 
 <file path=word/styles.xml><?xml version="1.0" encoding="utf-8"?>

</xml_diff>